<commit_message>
Integrate official event-aware congestion workflow
</commit_message>
<xml_diff>
--- a/part4/docs/Jason_Chen_final-project_su26.docx
+++ b/part4/docs/Jason_Chen_final-project_su26.docx
@@ -200,7 +200,7 @@
     </w:p>
     <w:p>
       <w:r>
-        <w:t>The Part III physical design was retained and implemented in PostgreSQL 18. The operational schema contains STATION, RIDERSHIP, PREDICTION, RECOMMENDATION, and USER_DECISION. Primary keys and foreign keys preserve referential integrity, while indexes support station-time retrieval and end-to-end workflow joins.</w:t>
+        <w:t>The Part III physical design was retained and implemented in PostgreSQL 18. Part IV extends the operational schema to six tables: STATION, RIDERSHIP, EVENT, PREDICTION, RECOMMENDATION, and USER_DECISION. Primary keys and foreign keys preserve referential integrity, while indexes support station-time retrieval, official-event matching, and end-to-end workflow joins.</w:t>
       </w:r>
     </w:p>
     <w:p>
@@ -515,28 +515,50 @@
     </w:p>
     <w:p>
       <w:pPr>
+        <w:keepNext/>
         <w:jc w:val="center"/>
       </w:pPr>
       <w:r>
-        <w:t xml:space="preserve">Figure </w:t>
-      </w:r>
-      <w:r>
-        <w:rPr>
-          <w:rFonts w:hint="eastAsia"/>
-        </w:rPr>
-        <w:t>4</w:t>
-      </w:r>
-      <w:r>
-        <w:t>. End-to-End Workflow of the Subway Congestion Decision Support Application</w:t>
-      </w:r>
-    </w:p>
-    <w:p>
-      <w:r>
-        <w:t xml:space="preserve">Historical MTA ridership data are validated and stored in PostgreSQL before </w:t>
-      </w:r>
-      <w:r>
-        <w:lastRenderedPageBreak/>
-        <w:t>model training. During application use, the commuter's future input and the persisted Random Forest model feed the prediction service. Prediction, recommendation, and user-decision results are then committed to their corresponding PostgreSQL tables.</w:t>
+        <w:t>Figure 4. Updated event-aware end-to-end reference architecture and automated operational workflow.</w:t>
+      </w:r>
+    </w:p>
+    <w:p>
+      <w:pPr>
+        <w:jc w:val="center"/>
+      </w:pPr>
+      <w:r>
+        <w:drawing>
+          <wp:inline xmlns:a="http://schemas.openxmlformats.org/drawingml/2006/main" xmlns:pic="http://schemas.openxmlformats.org/drawingml/2006/picture">
+            <wp:extent cx="5989320" cy="3533699"/>
+            <wp:docPr id="2050628066" name="Picture 2050628066"/>
+            <wp:cNvGraphicFramePr>
+              <a:graphicFrameLocks noChangeAspect="1"/>
+            </wp:cNvGraphicFramePr>
+            <a:graphic>
+              <a:graphicData uri="http://schemas.openxmlformats.org/drawingml/2006/picture">
+                <pic:pic>
+                  <pic:nvPicPr>
+                    <pic:cNvPr id="0" name="part4_reference_architecture_event.png"/>
+                    <pic:cNvPicPr/>
+                  </pic:nvPicPr>
+                  <pic:blipFill>
+                    <a:blip r:embed="rId34"/>
+                    <a:stretch>
+                      <a:fillRect/>
+                    </a:stretch>
+                  </pic:blipFill>
+                  <pic:spPr>
+                    <a:xfrm>
+                      <a:off x="0" y="0"/>
+                      <a:ext cx="5989320" cy="3533699"/>
+                    </a:xfrm>
+                    <a:prstGeom prst="rect"/>
+                  </pic:spPr>
+                </pic:pic>
+              </a:graphicData>
+            </a:graphic>
+          </wp:inline>
+        </w:drawing>
       </w:r>
     </w:p>
     <w:p>
@@ -657,7 +679,9 @@
     </w:p>
     <w:p>
       <w:pPr>
+        <w:keepNext/>
         <w:ind w:left="480"/>
+        <w:jc w:val="center"/>
       </w:pPr>
       <w:r>
         <w:t xml:space="preserve">Figure </w:t>
@@ -731,7 +755,9 @@
     </w:p>
     <w:p>
       <w:pPr>
+        <w:keepNext/>
         <w:ind w:left="480"/>
+        <w:jc w:val="center"/>
       </w:pPr>
       <w:r>
         <w:t xml:space="preserve">Figure </w:t>
@@ -819,7 +845,9 @@
     </w:p>
     <w:p>
       <w:pPr>
+        <w:keepNext/>
         <w:ind w:left="480"/>
+        <w:jc w:val="center"/>
       </w:pPr>
       <w:r>
         <w:rPr>
@@ -899,7 +927,7 @@
         <w:ind w:left="480"/>
       </w:pPr>
       <w:r>
-        <w:t>Although the initial project proposal considered event-aware congestion prediction, the final implemented scope focuses on recurring temporal and station-level ridership patterns. Event and incident datasets were evaluated as potential extensions but were not integrated because their reporting granularity and coverage could not be reliably aligned with the hourly ridership observations within the project timeline. The current model therefore predicts expected future congestion under recurring travel patterns rather than real-time event-specific disruptions. Event-aware prediction remains a planned extension.</w:t>
+        <w:t>The final application implements event-aware congestion guidance by synchronizing current permitted-event records from the official NYC Open Data dataset, NYC Permitted Event Information (tvpp-9vvx). Official Manhattan events are conservatively matched to the four NYU-area stations and stored in the EVENT table. Because these event records do not provide features that are directly aligned with the September-December 2024 hourly training observations, Event is not presented as a Random Forest training feature. Instead, the persisted Random Forest produces a recurring-pattern baseline, after which a transparent rule based on official event type and street-closure information may raise the congestion level. The baseline, adjustment amount, adjustment method, linked event, and final level are stored for auditability. Source: https://data.cityofnewyork.us/resource/tvpp-9vvx.json.</w:t>
       </w:r>
     </w:p>
     <w:p>
@@ -1098,6 +1126,10 @@
     </w:tbl>
     <w:p/>
     <w:p>
+      <w:pPr>
+        <w:keepNext/>
+        <w:jc w:val="center"/>
+      </w:pPr>
       <w:r>
         <w:t xml:space="preserve">Figure </w:t>
       </w:r>
@@ -1178,9 +1210,11 @@
     </w:p>
     <w:p>
       <w:pPr>
+        <w:keepNext/>
         <w:tabs>
           <w:tab w:val="left" w:pos="2106"/>
         </w:tabs>
+        <w:jc w:val="center"/>
       </w:pPr>
       <w:r>
         <w:t xml:space="preserve">Figure </w:t>
@@ -1259,6 +1293,10 @@
       </w:r>
     </w:p>
     <w:p>
+      <w:pPr>
+        <w:keepNext/>
+        <w:jc w:val="center"/>
+      </w:pPr>
       <w:r>
         <w:t>Figure 1</w:t>
       </w:r>
@@ -1322,6 +1360,10 @@
     </w:p>
     <w:p/>
     <w:p>
+      <w:pPr>
+        <w:keepNext/>
+        <w:jc w:val="center"/>
+      </w:pPr>
       <w:r>
         <w:t>Figure 1</w:t>
       </w:r>
@@ -1410,6 +1452,10 @@
       </w:r>
     </w:p>
     <w:p>
+      <w:pPr>
+        <w:keepNext/>
+        <w:jc w:val="center"/>
+      </w:pPr>
       <w:r>
         <w:t>Figure 1</w:t>
       </w:r>
@@ -1489,6 +1535,10 @@
     </w:p>
     <w:p/>
     <w:p>
+      <w:pPr>
+        <w:keepNext/>
+        <w:jc w:val="center"/>
+      </w:pPr>
       <w:r>
         <w:t xml:space="preserve">Figure </w:t>
       </w:r>
@@ -1607,7 +1657,7 @@
     </w:p>
     <w:p>
       <w:r>
-        <w:t>SQLAlchemy provides the object-relational mapping layer between Python and PostgreSQL. ORM classes represent the five operational tables, and managed sessions ensure that prediction, recommendation, and decision writes are committed consistently or rolled back after an error.</w:t>
+        <w:t>SQLAlchemy provides the object-relational mapping layer between Python and PostgreSQL. ORM classes represent the six operational tables: STATION, RIDERSHIP, EVENT, PREDICTION, RECOMMENDATION, and USER_DECISION. Managed sessions ensure that official-event synchronization and workflow writes are committed consistently or rolled back after an error.</w:t>
       </w:r>
     </w:p>
     <w:p>
@@ -1664,7 +1714,7 @@
     </w:p>
     <w:p>
       <w:r>
-        <w:t>The retraining process is repeatable and database-driven but manually initiated in the current prototype. Automatic source monitoring, scheduling, and model promotion remain future operational extensions.</w:t>
+        <w:t>The database-driven maintenance workflow is automated through run_pipeline.py. Each run verifies database connectivity, performs repeat-safe ridership loading when the source file changes, synchronizes official NYC event records, conditionally retrains a candidate model, verifies the resulting state, and writes a timestamped audit log. Candidate promotion remains deliberately controlled: a newly trained artifact is evaluated but does not automatically replace the production model.</w:t>
       </w:r>
     </w:p>
     <w:p>
@@ -1749,14 +1799,8 @@
     <w:p>
       <w:r>
         <w:t>5.1 Streamlit User Interface</w:t>
-      </w:r>
-      <w:r>
         <w:br/>
-        <w:t xml:space="preserve">The Streamlit interface allows the commuter to select one of the four NYU-area stations and enter a future travel date and time. After submission, the application displays the predicted congestion level, model confidence, estimated transfer context, recommended action, suggested departure time, </w:t>
-      </w:r>
-      <w:r>
-        <w:lastRenderedPageBreak/>
-        <w:t>and incentive information.</w:t>
+        <w:t>The Streamlit interface allows the commuter to select one of the four NYU-area stations and enter a future travel date and time. The user does not manually supply event information. After submission, the application checks synchronized official NYC event records for the selected station and time, displays the recurring-pattern Random Forest baseline and baseline confidence, applies any auditable event adjustment, and generates an actionable recommendation.</w:t>
       </w:r>
     </w:p>
     <w:p>
@@ -1765,24 +1809,7 @@
         <w:jc w:val="center"/>
       </w:pPr>
       <w:r>
-        <w:t xml:space="preserve">Figure </w:t>
-      </w:r>
-      <w:r>
-        <w:rPr>
-          <w:rFonts w:hint="eastAsia"/>
-        </w:rPr>
-        <w:t>1</w:t>
-      </w:r>
-      <w:r>
-        <w:t xml:space="preserve">5. </w:t>
-      </w:r>
-      <w:proofErr w:type="spellStart"/>
-      <w:r>
-        <w:t>Streamlit</w:t>
-      </w:r>
-      <w:proofErr w:type="spellEnd"/>
-      <w:r>
-        <w:t xml:space="preserve"> interface for submitting a future congestion prediction request.</w:t>
+        <w:t>Figure 15. Streamlit interface for submitting a future station and travel-time request.</w:t>
       </w:r>
     </w:p>
     <w:p>
@@ -1790,26 +1817,22 @@
         <w:jc w:val="center"/>
       </w:pPr>
       <w:r>
-        <w:rPr>
-          <w:noProof/>
-        </w:rPr>
         <w:drawing>
-          <wp:inline distT="0" distB="0" distL="0" distR="0" wp14:anchorId="3D5A3E71" wp14:editId="4A1A5C60">
-            <wp:extent cx="5669280" cy="4175600"/>
-            <wp:effectExtent l="0" t="0" r="0" b="0"/>
+          <wp:inline xmlns:a="http://schemas.openxmlformats.org/drawingml/2006/main" xmlns:pic="http://schemas.openxmlformats.org/drawingml/2006/picture">
+            <wp:extent cx="5852160" cy="5793930"/>
             <wp:docPr id="2050628063" name="Picture 2050628063"/>
             <wp:cNvGraphicFramePr>
-              <a:graphicFrameLocks xmlns:a="http://schemas.openxmlformats.org/drawingml/2006/main" noChangeAspect="1"/>
+              <a:graphicFrameLocks noChangeAspect="1"/>
             </wp:cNvGraphicFramePr>
-            <a:graphic xmlns:a="http://schemas.openxmlformats.org/drawingml/2006/main">
+            <a:graphic>
               <a:graphicData uri="http://schemas.openxmlformats.org/drawingml/2006/picture">
-                <pic:pic xmlns:pic="http://schemas.openxmlformats.org/drawingml/2006/picture">
+                <pic:pic>
                   <pic:nvPicPr>
-                    <pic:cNvPr id="0" name="codex-clipboard-64130103-0ad2-49fc-91d9-e008576e392b.png"/>
+                    <pic:cNvPr id="0" name="codex-clipboard-8650c394-1441-409a-880d-fd0297d6c0d3.png"/>
                     <pic:cNvPicPr/>
                   </pic:nvPicPr>
                   <pic:blipFill>
-                    <a:blip r:embed="rId22"/>
+                    <a:blip r:embed="rId31"/>
                     <a:stretch>
                       <a:fillRect/>
                     </a:stretch>
@@ -1817,11 +1840,9 @@
                   <pic:spPr>
                     <a:xfrm>
                       <a:off x="0" y="0"/>
-                      <a:ext cx="5669280" cy="4175600"/>
+                      <a:ext cx="5852160" cy="5793930"/>
                     </a:xfrm>
-                    <a:prstGeom prst="rect">
-                      <a:avLst/>
-                    </a:prstGeom>
+                    <a:prstGeom prst="rect"/>
                   </pic:spPr>
                 </pic:pic>
               </a:graphicData>
@@ -1837,74 +1858,40 @@
         <w:jc w:val="center"/>
       </w:pPr>
       <w:r>
-        <w:lastRenderedPageBreak/>
-        <w:t xml:space="preserve">Figure </w:t>
-      </w:r>
-      <w:r>
-        <w:rPr>
-          <w:rFonts w:hint="eastAsia"/>
-        </w:rPr>
-        <w:t>1</w:t>
-      </w:r>
-      <w:r>
-        <w:t xml:space="preserve">6. </w:t>
-      </w:r>
-      <w:proofErr w:type="spellStart"/>
-      <w:r>
-        <w:t>Streamlit</w:t>
-      </w:r>
-      <w:proofErr w:type="spellEnd"/>
-      <w:r>
-        <w:t xml:space="preserve"> future congestion prediction and recommendation.</w:t>
-      </w:r>
-    </w:p>
-    <w:p>
-      <w:r>
-        <w:rPr>
-          <w:noProof/>
-        </w:rPr>
+        <w:t>Figure 16. Event-aware result showing automatic official-event detection, the Random Forest baseline, event adjustment, recommendation, and the commuter's accepted decision.</w:t>
+      </w:r>
+    </w:p>
+    <w:p>
+      <w:pPr>
+        <w:jc w:val="center"/>
+      </w:pPr>
+      <w:r>
         <w:drawing>
-          <wp:inline distT="0" distB="0" distL="0" distR="0" wp14:anchorId="771A999B" wp14:editId="0ED19FEA">
-            <wp:extent cx="5274945" cy="4281170"/>
-            <wp:effectExtent l="0" t="0" r="1905" b="5080"/>
-            <wp:docPr id="960152946" name="圖片 4"/>
+          <wp:inline xmlns:a="http://schemas.openxmlformats.org/drawingml/2006/main" xmlns:pic="http://schemas.openxmlformats.org/drawingml/2006/picture">
+            <wp:extent cx="5852160" cy="5852160"/>
+            <wp:docPr id="2050628064" name="Picture 2050628064"/>
             <wp:cNvGraphicFramePr>
-              <a:graphicFrameLocks xmlns:a="http://schemas.openxmlformats.org/drawingml/2006/main" noChangeAspect="1"/>
+              <a:graphicFrameLocks noChangeAspect="1"/>
             </wp:cNvGraphicFramePr>
-            <a:graphic xmlns:a="http://schemas.openxmlformats.org/drawingml/2006/main">
+            <a:graphic>
               <a:graphicData uri="http://schemas.openxmlformats.org/drawingml/2006/picture">
-                <pic:pic xmlns:pic="http://schemas.openxmlformats.org/drawingml/2006/picture">
+                <pic:pic>
                   <pic:nvPicPr>
-                    <pic:cNvPr id="0" name="Picture 4"/>
-                    <pic:cNvPicPr>
-                      <a:picLocks noChangeAspect="1" noChangeArrowheads="1"/>
-                    </pic:cNvPicPr>
+                    <pic:cNvPr id="0" name="codex-clipboard-a9272924-1517-49f0-acf0-fb123b359b09.png"/>
+                    <pic:cNvPicPr/>
                   </pic:nvPicPr>
                   <pic:blipFill>
-                    <a:blip r:embed="rId23" cstate="print">
-                      <a:extLst>
-                        <a:ext uri="{28A0092B-C50C-407E-A947-70E740481C1C}">
-                          <a14:useLocalDpi xmlns:a14="http://schemas.microsoft.com/office/drawing/2010/main" val="0"/>
-                        </a:ext>
-                      </a:extLst>
-                    </a:blip>
-                    <a:srcRect/>
+                    <a:blip r:embed="rId32"/>
                     <a:stretch>
                       <a:fillRect/>
                     </a:stretch>
                   </pic:blipFill>
-                  <pic:spPr bwMode="auto">
+                  <pic:spPr>
                     <a:xfrm>
                       <a:off x="0" y="0"/>
-                      <a:ext cx="5274945" cy="4281170"/>
+                      <a:ext cx="5852160" cy="5852160"/>
                     </a:xfrm>
-                    <a:prstGeom prst="rect">
-                      <a:avLst/>
-                    </a:prstGeom>
-                    <a:noFill/>
-                    <a:ln>
-                      <a:noFill/>
-                    </a:ln>
+                    <a:prstGeom prst="rect"/>
                   </pic:spPr>
                 </pic:pic>
               </a:graphicData>
@@ -1920,74 +1907,40 @@
         <w:jc w:val="center"/>
       </w:pPr>
       <w:r>
-        <w:lastRenderedPageBreak/>
-        <w:t xml:space="preserve">Figure </w:t>
-      </w:r>
-      <w:r>
-        <w:rPr>
-          <w:rFonts w:hint="eastAsia"/>
-        </w:rPr>
-        <w:t>1</w:t>
-      </w:r>
-      <w:r>
-        <w:t xml:space="preserve">7. </w:t>
-      </w:r>
-      <w:proofErr w:type="spellStart"/>
-      <w:r>
-        <w:t>Streamlit</w:t>
-      </w:r>
-      <w:proofErr w:type="spellEnd"/>
-      <w:r>
-        <w:t xml:space="preserve"> confirmation that the commuter decision was saved.</w:t>
-      </w:r>
-    </w:p>
-    <w:p>
-      <w:r>
-        <w:rPr>
-          <w:noProof/>
-        </w:rPr>
+        <w:t>Figure 17. PostgreSQL verification of Prediction ID 28, including the baseline, official-event adjustment method, final congestion level, linked recommendation, and accepted user decision.</w:t>
+      </w:r>
+    </w:p>
+    <w:p>
+      <w:pPr>
+        <w:jc w:val="center"/>
+      </w:pPr>
+      <w:r>
         <w:drawing>
-          <wp:inline distT="0" distB="0" distL="0" distR="0" wp14:anchorId="266B8773" wp14:editId="6E5A0729">
-            <wp:extent cx="5269865" cy="4735830"/>
-            <wp:effectExtent l="0" t="0" r="6985" b="7620"/>
-            <wp:docPr id="1902732753" name="圖片 5"/>
+          <wp:inline xmlns:a="http://schemas.openxmlformats.org/drawingml/2006/main" xmlns:pic="http://schemas.openxmlformats.org/drawingml/2006/picture">
+            <wp:extent cx="5852160" cy="3206663"/>
+            <wp:docPr id="2050628065" name="Picture 2050628065"/>
             <wp:cNvGraphicFramePr>
-              <a:graphicFrameLocks xmlns:a="http://schemas.openxmlformats.org/drawingml/2006/main" noChangeAspect="1"/>
+              <a:graphicFrameLocks noChangeAspect="1"/>
             </wp:cNvGraphicFramePr>
-            <a:graphic xmlns:a="http://schemas.openxmlformats.org/drawingml/2006/main">
+            <a:graphic>
               <a:graphicData uri="http://schemas.openxmlformats.org/drawingml/2006/picture">
-                <pic:pic xmlns:pic="http://schemas.openxmlformats.org/drawingml/2006/picture">
+                <pic:pic>
                   <pic:nvPicPr>
-                    <pic:cNvPr id="0" name="Picture 5"/>
-                    <pic:cNvPicPr>
-                      <a:picLocks noChangeAspect="1" noChangeArrowheads="1"/>
-                    </pic:cNvPicPr>
+                    <pic:cNvPr id="0" name="codex-clipboard-f9595eed-0702-4f2b-9f42-18c0904d298f.png"/>
+                    <pic:cNvPicPr/>
                   </pic:nvPicPr>
                   <pic:blipFill>
-                    <a:blip r:embed="rId24" cstate="print">
-                      <a:extLst>
-                        <a:ext uri="{28A0092B-C50C-407E-A947-70E740481C1C}">
-                          <a14:useLocalDpi xmlns:a14="http://schemas.microsoft.com/office/drawing/2010/main" val="0"/>
-                        </a:ext>
-                      </a:extLst>
-                    </a:blip>
-                    <a:srcRect/>
+                    <a:blip r:embed="rId33"/>
                     <a:stretch>
                       <a:fillRect/>
                     </a:stretch>
                   </pic:blipFill>
-                  <pic:spPr bwMode="auto">
+                  <pic:spPr>
                     <a:xfrm>
                       <a:off x="0" y="0"/>
-                      <a:ext cx="5269865" cy="4735830"/>
+                      <a:ext cx="5852160" cy="3206663"/>
                     </a:xfrm>
-                    <a:prstGeom prst="rect">
-                      <a:avLst/>
-                    </a:prstGeom>
-                    <a:noFill/>
-                    <a:ln>
-                      <a:noFill/>
-                    </a:ln>
+                    <a:prstGeom prst="rect"/>
                   </pic:spPr>
                 </pic:pic>
               </a:graphicData>
@@ -2003,35 +1956,45 @@
         </w:rPr>
       </w:pPr>
       <w:r>
-        <w:t>5.2 Prediction, Recommendation, and User-Decision Transactions</w:t>
-      </w:r>
-      <w:r>
+        <w:t>5.2 Event-Aware Prediction, Recommendation, and User-Decision Transactions</w:t>
         <w:br/>
-      </w:r>
-      <w:r>
-        <w:t xml:space="preserve">Each request creates a PREDICTION record containing the station, requested future time, congestion level, and confidence score. The model version is stored in the persisted </w:t>
-      </w:r>
-      <w:proofErr w:type="spellStart"/>
-      <w:r>
-        <w:t>Joblib</w:t>
-      </w:r>
-      <w:proofErr w:type="spellEnd"/>
-      <w:r>
-        <w:t xml:space="preserve"> bundle and displayed by the application for traceability.</w:t>
-      </w:r>
-      <w:r>
-        <w:t xml:space="preserve"> The rule-based recommendation engine then creates a linked RECOMMENDATION record. Finally, the commuter's Accepted or Kept Original Plan response is written to USER_DECISION, completing the required ML-to-OLTP closed loop.</w:t>
-      </w:r>
-    </w:p>
-    <w:p>
-      <w:r>
-        <w:t>A successful future demonstration used 8 St-NYU at 6:00 PM on September 1, 2026. The model predicted Medium congestion with 65.0% confidence, generated a recommendation to depart 15 minutes later, and saved the commuter's Accepted response as Decision ID 3.</w:t>
-      </w:r>
-    </w:p>
-    <w:p>
-      <w:r>
-        <w:lastRenderedPageBreak/>
-        <w:t>The 65.0% confidence is the predicted probability for this individual result and is distinct from overall model accuracy. The production baseline achieved 84.8% accuracy, while the chronological candidate achieved 76.75%.</w:t>
+        <w:t>Each request first produces a Random Forest baseline from recurring station-hour patterns. The application then searches the EVENT table for an official event near the selected station and requested time. A transparent event-type and street-closure rule may adjust the baseline, after which PREDICTION stores the baseline level, adjustment amount, adjustment method, final level, confidence, model version, and linked event. The recommendation engine creates a linked RECOMMENDATION record, and the commuter's Accepted or Kept Original Plan response is written to USER_DECISION, completing the ML-to-OLTP closed loop.</w:t>
+      </w:r>
+    </w:p>
+    <w:p>
+      <w:r>
+        <w:t>The final event-aware demonstration used W 4 St-Wash Sq at 3:00 PM on September 20, 2026. The system automatically matched the official Washington Square Park Folk Festival (source event 922115:2). The Random Forest baseline was Medium with 99.0% baseline confidence; the event's Medium risk produced a documented +1 adjustment, resulting in final High congestion. The application generated Recommendation ID 27 and saved the commuter's Accepted response as Decision ID 9 under Prediction ID 28.</w:t>
+      </w:r>
+    </w:p>
+    <w:p>
+      <w:r>
+        <w:t>The displayed 99.0% is the Random Forest probability for the baseline class in this individual request, not the accuracy of the complete event-aware system. The production baseline achieved 84.8% accuracy in Part III, while the chronological retraining candidate achieved 76.75%. The event adjustment is a separate, transparent business rule and does not change or retrain the Random Forest probability.</w:t>
+      </w:r>
+    </w:p>
+    <w:p>
+      <w:pPr>
+        <w:ind w:left="480"/>
+      </w:pPr>
+    </w:p>
+    <w:p>
+      <w:pPr>
+        <w:rPr>
+          <w:sz w:val="32"/>
+          <w:szCs w:val="32"/>
+        </w:rPr>
+      </w:pPr>
+      <w:r>
+        <w:rPr>
+          <w:rFonts w:hint="eastAsia"/>
+          <w:sz w:val="32"/>
+          <w:szCs w:val="32"/>
+        </w:rPr>
+        <w:t>6. Database Validation and Query Optimization</w:t>
+      </w:r>
+    </w:p>
+    <w:p>
+      <w:r>
+        <w:t>PostgreSQL validation confirmed 11,667 RIDERSHIP rows distributed across four stations and three balanced congestion classes. The complete workflow join verifies the relationship PREDICTION → RECOMMENDATION → USER_DECISION. EXPLAIN (ANALYZE, BUFFERS) shows index scans for station-time retrieval and workflow joins, including ix_ridership_timestamp, ux_station_mta_complex_id, prediction_pkey, idx_recommendation_prediction, and ix_user_decision_recommendation. Observed execution times were below two milliseconds on the local dataset.</w:t>
       </w:r>
     </w:p>
     <w:p>
@@ -2041,117 +2004,7 @@
         <w:jc w:val="center"/>
       </w:pPr>
       <w:r>
-        <w:t xml:space="preserve">Figure </w:t>
-      </w:r>
-      <w:r>
-        <w:rPr>
-          <w:rFonts w:hint="eastAsia"/>
-        </w:rPr>
-        <w:t>1</w:t>
-      </w:r>
-      <w:r>
-        <w:t>8. SQL workflow join for the future demonstration request.</w:t>
-      </w:r>
-    </w:p>
-    <w:p>
-      <w:r>
-        <w:rPr>
-          <w:noProof/>
-        </w:rPr>
-        <w:drawing>
-          <wp:inline distT="0" distB="0" distL="0" distR="0" wp14:anchorId="137288A5" wp14:editId="073894DF">
-            <wp:extent cx="5264150" cy="2806700"/>
-            <wp:effectExtent l="0" t="0" r="0" b="0"/>
-            <wp:docPr id="269204038" name="圖片 8"/>
-            <wp:cNvGraphicFramePr>
-              <a:graphicFrameLocks xmlns:a="http://schemas.openxmlformats.org/drawingml/2006/main" noChangeAspect="1"/>
-            </wp:cNvGraphicFramePr>
-            <a:graphic xmlns:a="http://schemas.openxmlformats.org/drawingml/2006/main">
-              <a:graphicData uri="http://schemas.openxmlformats.org/drawingml/2006/picture">
-                <pic:pic xmlns:pic="http://schemas.openxmlformats.org/drawingml/2006/picture">
-                  <pic:nvPicPr>
-                    <pic:cNvPr id="0" name="Picture 8"/>
-                    <pic:cNvPicPr>
-                      <a:picLocks noChangeAspect="1" noChangeArrowheads="1"/>
-                    </pic:cNvPicPr>
-                  </pic:nvPicPr>
-                  <pic:blipFill>
-                    <a:blip r:embed="rId25" cstate="print">
-                      <a:extLst>
-                        <a:ext uri="{28A0092B-C50C-407E-A947-70E740481C1C}">
-                          <a14:useLocalDpi xmlns:a14="http://schemas.microsoft.com/office/drawing/2010/main" val="0"/>
-                        </a:ext>
-                      </a:extLst>
-                    </a:blip>
-                    <a:srcRect/>
-                    <a:stretch>
-                      <a:fillRect/>
-                    </a:stretch>
-                  </pic:blipFill>
-                  <pic:spPr bwMode="auto">
-                    <a:xfrm>
-                      <a:off x="0" y="0"/>
-                      <a:ext cx="5264150" cy="2806700"/>
-                    </a:xfrm>
-                    <a:prstGeom prst="rect">
-                      <a:avLst/>
-                    </a:prstGeom>
-                    <a:noFill/>
-                    <a:ln>
-                      <a:noFill/>
-                    </a:ln>
-                  </pic:spPr>
-                </pic:pic>
-              </a:graphicData>
-            </a:graphic>
-          </wp:inline>
-        </w:drawing>
-      </w:r>
-    </w:p>
-    <w:p>
-      <w:pPr>
-        <w:ind w:left="480"/>
-      </w:pPr>
-    </w:p>
-    <w:p>
-      <w:pPr>
-        <w:rPr>
-          <w:sz w:val="32"/>
-          <w:szCs w:val="32"/>
-        </w:rPr>
-      </w:pPr>
-      <w:r>
-        <w:rPr>
-          <w:rFonts w:hint="eastAsia"/>
-          <w:sz w:val="32"/>
-          <w:szCs w:val="32"/>
-        </w:rPr>
-        <w:t>6. Database Validation and Query Optimization</w:t>
-      </w:r>
-    </w:p>
-    <w:p>
-      <w:r>
-        <w:t>PostgreSQL validation confirmed 11,667 RIDERSHIP rows distributed across four stations and three balanced congestion classes. The complete workflow join verifies the relationship PREDICTION → RECOMMENDATION → USER_DECISION. EXPLAIN (ANALYZE, BUFFERS) shows index scans for station-time retrieval and workflow joins, including ix_ridership_timestamp, ux_station_mta_complex_id, prediction_pkey, idx_recommendation_prediction, and ix_user_decision_recommendation. Observed execution times were below two milliseconds on the local dataset.</w:t>
-      </w:r>
-    </w:p>
-    <w:p>
-      <w:pPr>
-        <w:keepNext/>
-        <w:keepLines/>
-        <w:jc w:val="center"/>
-      </w:pPr>
-      <w:r>
-        <w:lastRenderedPageBreak/>
-        <w:t xml:space="preserve">Figure </w:t>
-      </w:r>
-      <w:r>
-        <w:rPr>
-          <w:rFonts w:hint="eastAsia"/>
-        </w:rPr>
-        <w:t>1</w:t>
-      </w:r>
-      <w:r>
-        <w:t>9. EXPLAIN ANALYZE plan using the ridership timestamp index.</w:t>
+        <w:t>Figure 18. EXPLAIN ANALYZE plan using the ridership timestamp index.</w:t>
       </w:r>
     </w:p>
     <w:p>
@@ -2216,16 +2069,7 @@
         <w:jc w:val="center"/>
       </w:pPr>
       <w:r>
-        <w:t xml:space="preserve">Figure </w:t>
-      </w:r>
-      <w:r>
-        <w:rPr>
-          <w:rFonts w:hint="eastAsia"/>
-        </w:rPr>
-        <w:t>2</w:t>
-      </w:r>
-      <w:r>
-        <w:t>0. EXPLAIN ANALYZE plan using indexes across the complete workflow join.</w:t>
+        <w:t>Figure 19. EXPLAIN ANALYZE plan using indexes across the complete workflow join.</w:t>
       </w:r>
     </w:p>
     <w:p>
@@ -2321,7 +2165,7 @@
     </w:p>
     <w:p>
       <w:r>
-        <w:t>The business domain defines the commuter decision-support objective and the requirement that recommendations remain optional. The application domain contains Streamlit and the prediction, recommendation, and user-decision services. The DIKW domain transforms validated ridership data into engineered features, congestion predictions, recommendations, and recorded commuter actions. The infrastructure domain provides Python, Pandas, scikit-learn, Joblib, SQLAlchemy, and PostgreSQL.</w:t>
+        <w:t>The business domain defines the commuter decision-support objective and the requirement that recommendations remain optional. The application domain contains Streamlit and the official-event synchronization, prediction, recommendation, and user-decision services. The DIKW domain transforms validated ridership and permitted-event records into engineered features, a recurring-pattern baseline, an auditable event adjustment, recommendations, and recorded commuter actions. The infrastructure domain provides the NYC Open Data API, Python, Pandas, scikit-learn, Joblib, SQLAlchemy, and PostgreSQL.</w:t>
       </w:r>
     </w:p>
     <w:p>
@@ -2414,7 +2258,7 @@
         <w:keepLines/>
       </w:pPr>
       <w:r>
-        <w:t>Predictions should be interpreted as expected congestion patterns rather than guaranteed conditions. The model is trained on four NYU-area stations and September–December 2024 observations, so its results may not generalize to other stations, seasons, major events, weather disruptions, or changes in subway service.</w:t>
+        <w:t>Predictions should be interpreted as decision-support estimates rather than guaranteed conditions. The Random Forest baseline is trained on four NYU-area stations and September-December 2024 observations, so it may not generalize to other stations, seasons, weather disruptions, or service changes. Official-event matching is conservative and text based because the selected public event feed does not provide attendance or consistently usable coordinates. Unmatched events are skipped, and the event adjustment remains a transparent scenario rule rather than a learned Random Forest feature.</w:t>
       </w:r>
     </w:p>
     <w:p>

</xml_diff>